<commit_message>
refactor: Clean up project root directory structure
- Reorganize 52 files  14 files in root for better maintainability
- Create organized script directories:
  - scripts/seed/ for database seeding scripts
  - scripts/update/ for update utilities
  - scripts/verify/ for verification scripts
  - scripts/test/ for ad-hoc test scripts
- Move build artifacts to artifacts/ directory:
  - artifacts/coverage/ for test coverage reports
  - artifacts/logs/ for log files
- Move Dockerfile to deployment/ directory
- Remove deprecated Gemini API related files
- Update .gitignore to exclude artifacts/

This improves project organization and makes the root directory much cleaner.
</commit_message>
<xml_diff>
--- a/docs/BIMO_사용자매뉴얼.docx
+++ b/docs/BIMO_사용자매뉴얼.docx
@@ -59,6 +59,14 @@
     </w:p>
     <w:p>
       <w:pPr>
+        <w:pStyle w:val="ListBullet"/>
+      </w:pPr>
+      <w:r>
+        <w:t>**프로젝트 범위(백엔드)**: 인증(JWT) · 항공편/공항 검색(Duffel) · 마이플라이트(Firestore) · 리뷰/항공사 통계 · LLM 기반 웰니스 타임라인(Ollama) · 알림(FCM) · 오프라인/동기화</w:t>
+      </w:r>
+    </w:p>
+    <w:p>
+      <w:pPr>
         <w:pStyle w:val="Heading3"/>
       </w:pPr>
       <w:r>
@@ -70,7 +78,7 @@
         <w:pStyle w:val="ListBullet"/>
       </w:pPr>
       <w:r>
-        <w:t>**팀 번호**: (여기에 기입)</w:t>
+        <w:t>**팀 번호**: (예: 00조) ← 제출 전 반드시 수정</w:t>
       </w:r>
     </w:p>
     <w:p>
@@ -83,7 +91,7 @@
     </w:p>
     <w:p>
       <w:r>
-        <w:t>아래 표는 제출용 양식입니다. 팀에 맞게 수정하세요.</w:t>
+        <w:t>아래 표는 제출용 양식입니다. 팀에 맞게 수정하세요(역할/담당 기능은 실제 구현 기준).</w:t>
       </w:r>
     </w:p>
     <w:tbl>
@@ -419,6 +427,38 @@
       </w:r>
     </w:p>
     <w:p>
+      <w:pPr>
+        <w:pStyle w:val="Heading3"/>
+      </w:pPr>
+      <w:r>
+        <w:t>2.5 정리: BIMO-BE가 해결하는 방향</w:t>
+      </w:r>
+    </w:p>
+    <w:p>
+      <w:pPr>
+        <w:pStyle w:val="ListBullet"/>
+      </w:pPr>
+      <w:r>
+        <w:t>**정보/흐름 통합**: 항공편(검색/저장) · 리뷰 · 타임라인 · 알림을 사용자 단위로 묶어 “한 흐름”으로 연결</w:t>
+      </w:r>
+    </w:p>
+    <w:p>
+      <w:pPr>
+        <w:pStyle w:val="ListBullet"/>
+      </w:pPr>
+      <w:r>
+        <w:t>**개인화 강화**: 비행 목적(수면/업무/휴식) 기반의 일정 제안(웰니스 타임라인)</w:t>
+      </w:r>
+    </w:p>
+    <w:p>
+      <w:pPr>
+        <w:pStyle w:val="ListBullet"/>
+      </w:pPr>
+      <w:r>
+        <w:t>**현실적인 사용 환경 반영**: 공항/기내의 네트워크 불안정을 고려한 오프라인/동기화 기반</w:t>
+      </w:r>
+    </w:p>
+    <w:p>
       <w:r>
         <w:t>――――――――――――――――――――</w:t>
       </w:r>
@@ -2032,6 +2072,14 @@
     </w:p>
     <w:p>
       <w:pPr>
+        <w:pStyle w:val="ListBullet"/>
+      </w:pPr>
+      <w:r>
+        <w:t>**일관된 데이터 보관**: 마이플라이트/리뷰/알림 설정이 사용자 계정 단위로 관리되어 기기 변경 시에도 유지</w:t>
+      </w:r>
+    </w:p>
+    <w:p>
+      <w:pPr>
         <w:pStyle w:val="Heading3"/>
       </w:pPr>
       <w:r>
@@ -2060,6 +2108,14 @@
       </w:pPr>
       <w:r>
         <w:t>**외부 서비스 연동 기반**: Duffel(항공편 검색), Firebase(인증/DB/FCM), Ollama(LLM)로 확장성 확보</w:t>
+      </w:r>
+    </w:p>
+    <w:p>
+      <w:pPr>
+        <w:pStyle w:val="ListBullet"/>
+      </w:pPr>
+      <w:r>
+        <w:t>**운영/장애 대응 용이**: 기능별 라우터 분리 및 로그/에러 처리 체계로 이슈 범위 축소 및 빠른 원인 파악</w:t>
       </w:r>
     </w:p>
     <w:p>
@@ -2080,7 +2136,15 @@
         <w:pStyle w:val="ListBullet"/>
       </w:pPr>
       <w:r>
-        <w:t>**Repository**: `https://github.com/BIMO-2025/BIMO-BE.git`</w:t>
+        <w:t>**Repository (웹)**: `https://github.com/BIMO-2025/BIMO-BE`</w:t>
+      </w:r>
+    </w:p>
+    <w:p>
+      <w:pPr>
+        <w:pStyle w:val="ListBullet"/>
+      </w:pPr>
+      <w:r>
+        <w:t>**Repository (Clone)**: `https://github.com/BIMO-2025/BIMO-BE.git`</w:t>
       </w:r>
     </w:p>
     <w:sectPr>

</xml_diff>